<commit_message>
Corregir validación holdout y actualizar informe
</commit_message>
<xml_diff>
--- a/reports/Informe_Proyecto_1_MLP.docx
+++ b/reports/Informe_Proyecto_1_MLP.docx
@@ -108,7 +108,7 @@
     </w:p>
     <w:p>
       <w:r>
-        <w:t>Se desarrolló un MLP para regresión sobre 1,168 viviendas y 80 predictores. La configuración se seleccionó sin consultar el holdout, mediante exploración, 17 trials de Optuna (5 podados) y una confirmación estratificada de cinco folds. El modelo ganador redujo el RMSE CV de 36,873.49 a 26,847.57 USD (27.2%); en el holdout interno independiente obtuvo 17,754.33 USD. El artefacto de competencia se reentrenó después con todas las observaciones disponibles. Todas las métricas se calcularon en la escala original de SalePrice.</w:t>
+        <w:t>Se desarrolló un MLP para regresión sobre 1,168 viviendas, 79 variables predictoras y la columna Id. La configuración se seleccionó sin consultar el holdout, mediante exploración, 18 trials de Optuna (6 podados) y una confirmación estratificada de cinco folds. El modelo ganador redujo el RMSE CV de 36,873.49 a 26,847.57 USD (27.2%); en el holdout interno independiente obtuvo 19,916.20 USD. El artefacto de competencia se reentrenó después con todas las observaciones disponibles. Todas las métricas se calcularon en la escala original de SalePrice.</w:t>
       </w:r>
     </w:p>
     <w:p>
@@ -142,7 +142,7 @@
     </w:p>
     <w:p>
       <w:r>
-        <w:t>El CSV contiene 1,168 observaciones y 81 columnas: Id, 36 predictores numericos, 43 categóricos y SalePrice. No hay filas ni Id duplicados. MSSubClass (15 códigos de tipo constructivo) y MoSold (12 meses) son números por almacenamiento, pero semánticamente son categorías; OverallQual y OverallCond se conservaron como escalas ordinales numéricas.</w:t>
+        <w:t>El CSV contiene 1,168 observaciones y 81 columnas: Id, 36 predictores numéricos, 43 categóricos y SalePrice. No hay filas ni Id duplicados. MSSubClass (15 códigos de tipo constructivo) y MoSold (12 meses) son números por almacenamiento, pero semánticamente son categorías; OverallQual y OverallCond se conservaron como escalas ordinales numéricas.</w:t>
       </w:r>
     </w:p>
     <w:tbl>
@@ -1593,7 +1593,7 @@
     </w:p>
     <w:p>
       <w:r>
-        <w:t>Los boxplots y scatterplots revelaron colas largas en LotArea, GrLivArea y superficies de sótano/garage. En vez de borrar observaciones posiblemente válidas, el pipeline ganador aprendio límites en los percentiles 1 y 99 dentro de cada fold. Esta decisión reduce la influencia de extremos sobre gradientes sin usar información de válidación.</w:t>
+        <w:t>Los boxplots y scatterplots revelaron colas largas en LotArea, GrLivArea y superficies de sótano/garage. En vez de borrar observaciones posiblemente válidas, el pipeline ganador aprendió límites en los percentiles 1 y 99 dentro de cada fold. Esta decisión reduce la influencia de extremos sobre gradientes sin usar información de validación.</w:t>
       </w:r>
     </w:p>
     <w:p>
@@ -2234,7 +2234,7 @@
     </w:p>
     <w:p>
       <w:r>
-        <w:t>OverallQual (0.786) y GrLivArea (0.696) dominan las relaciones lineales, seguidas por capacidad/área de garage, sótano y primer piso. Las relaciones no son enteramente lineales: la dispersión aumenta en casas costosas y Neighborhood desplaza claramente la mediana del precio. La colinealidad entre medidas de área (GarageCars/GarageArea o 1stFlrSF/TotalBsmtSF) no obliga a eliminarlas en un MLP regularizado, pero si aumenta el riesgo de sobreajuste.</w:t>
+        <w:t>OverallQual (0.786) y GrLivArea (0.696) dominan las relaciones lineales, seguidas por capacidad/área de garage, sótano y primer piso. Las relaciones no son enteramente lineales: la dispersión aumenta en casas costosas y Neighborhood desplaza claramente la mediana del precio. La colinealidad entre medidas de área (GarageCars/GarageArea o 1stFlrSF/TotalBsmtSF) no obliga a eliminarlas en un MLP regularizado, pero sí aumenta el riesgo de sobreajuste.</w:t>
       </w:r>
     </w:p>
     <w:p>
@@ -2366,7 +2366,7 @@
         <w:ind w:left="720" w:hanging="360"/>
       </w:pPr>
       <w:r>
-        <w:t>Categoricas: Missing explicito, one-hot, categorías infrecuentes agrupadas con min_frequency=5 y tolerancia a niveles no vistos.</w:t>
+        <w:t>Categóricas: Missing explícito, one-hot, categorías infrecuentes agrupadas con min_frequency=5 y tolerancia a niveles no vistos.</w:t>
       </w:r>
     </w:p>
     <w:p>
@@ -2376,7 +2376,7 @@
         <w:ind w:left="720" w:hanging="360"/>
       </w:pPr>
       <w:r>
-        <w:t>Numericas: mediana e indicador de ausencia, clipping 1/99, log1p solo para columnas no negativas con asimetría absoluta mayor a 0.75 y RobustScaler.</w:t>
+        <w:t>Numéricas: mediana e indicador de ausencia, clipping 1/99, log1p solo para columnas no negativas con asimetría absoluta mayor a 0.75 y RobustScaler.</w:t>
       </w:r>
     </w:p>
     <w:p>
@@ -2386,7 +2386,7 @@
         <w:ind w:left="720" w:hanging="360"/>
       </w:pPr>
       <w:r>
-        <w:t>Ingenieria de variables: superficie total, baños equivalentes, porches, antigüedad al vender, tiempo desde remodelacion e interacciones calidad-superficie.</w:t>
+        <w:t>Ingeniería de variables: superficie total, baños equivalentes, porches, antigüedad al vender, tiempo desde remodelación e interacciones calidad-superficie.</w:t>
       </w:r>
     </w:p>
     <w:p>
@@ -2412,12 +2412,12 @@
         <w:pStyle w:val="Heading2"/>
       </w:pPr>
       <w:r>
-        <w:t>2.1 Separacion y control de leakage</w:t>
+        <w:t>2.1 Separación y control de leakage</w:t>
       </w:r>
     </w:p>
     <w:p>
       <w:r>
-        <w:t>Se reservó 20% como holdout interno con random_state=20260817 y estratificación por deciles de precio. El 80% restante se usó para exploración y Optuna con tres folds estratificados. Los tres candidatos más prometedores se reevaluaron en una partición nueva de cinco folds (seed 31415). Solo después de elegir el ganador se abrio el holdout. Imputadores, umbrales de asimetría, percentiles, escaladores, agrupación de categorías y one-hot se ajustaron exclusivamente en el train de cada fold.</w:t>
+        <w:t>Se reservó 20% como holdout interno con random_state=20260817 y estratificación por deciles de precio. El 80% restante se usó para exploración y Optuna con tres folds estratificados. Los tres candidatos más prometedores se reevaluaron en una partición nueva de cinco folds (seed 31415). La mediana de épocas de esa CV se fijó antes de abrir el holdout; el modelo de validación se reentrenó desde cero durante ese número fijo de épocas. Imputadores, umbrales de asimetría, percentiles, escaladores, agrupación de categorías y one-hot se ajustaron exclusivamente en el train de cada fold.</w:t>
       </w:r>
     </w:p>
     <w:p>
@@ -2500,7 +2500,7 @@
                 <w:b/>
                 <w:sz w:val="19"/>
               </w:rPr>
-              <w:t>Configuracion final</w:t>
+              <w:t>Configuración final</w:t>
             </w:r>
           </w:p>
         </w:tc>
@@ -2585,7 +2585,7 @@
                 <w:rFonts w:ascii="Calibri" w:hAnsi="Calibri"/>
                 <w:sz w:val="19"/>
               </w:rPr>
-              <w:t>Activacion</w:t>
+              <w:t>Activación</w:t>
             </w:r>
           </w:p>
         </w:tc>
@@ -3050,7 +3050,7 @@
                 <w:rFonts w:ascii="Calibri" w:hAnsi="Calibri"/>
                 <w:sz w:val="19"/>
               </w:rPr>
-              <w:t>Norma maxima 5.0</w:t>
+              <w:t>Norma máxima 5.0</w:t>
             </w:r>
           </w:p>
         </w:tc>
@@ -3181,12 +3181,12 @@
         <w:pStyle w:val="Heading2"/>
       </w:pPr>
       <w:r>
-        <w:t>2.3 Busqueda de hiperparámetros</w:t>
+        <w:t>2.3 Búsqueda de hiperparámetros</w:t>
       </w:r>
     </w:p>
     <w:p>
       <w:r>
-        <w:t>Optuna con TPE exploró 17 trials y podó 5 mediante MedianPruner. Se variaron profundidad/ancho, ReLU/GELU/LeakyReLU/SiLU, dropout, normalizacion, Adam/AdamW, learning rate, weight decay, batch size, target original/log1p, Standard/RobustScaler, clipping, umbral de asimetría, frecuencia minima e ingeniería de features. La métrica objetiva siempre fue RMSE tras invertir cualquier transformación del objetivo.</w:t>
+        <w:t>Optuna con TPE exploró 18 trials y podó 6 mediante MedianPruner. Se variaron profundidad/ancho, ReLU/GELU/LeakyReLU/SiLU, dropout, normalización, Adam/AdamW, learning rate, weight decay, batch size, target original/log1p, Standard/RobustScaler, clipping, umbral de asimetría, frecuencia mínima e ingeniería de features. La métrica objetiva siempre fue RMSE tras invertir cualquier transformación del objetivo.</w:t>
       </w:r>
     </w:p>
     <w:p>
@@ -4410,12 +4410,12 @@
           <w:color w:val="666666"/>
           <w:sz w:val="18"/>
         </w:rPr>
-        <w:t>Fuente: experiments/results.csv, generado automaticamente por ejecuciones reales.</w:t>
+        <w:t>Fuente: experiments/results.csv, generado automáticamente por ejecuciones reales.</w:t>
       </w:r>
     </w:p>
     <w:p>
       <w:r>
-        <w:t>La mejora total contra el baseline fue de 10,025.92 USD (27.2%). La red profunda sin regularización alcanzó RMSE train de 8,021 pero CV de 33,963, evidencia de sobreajuste. El baseline log1p empeoró a 44,354: simetrizar el target no alineó la loss con la penalización absoluta del RMSE oficial. RobustScaler, clipping, weight decay y dropout estabilizaron el entrenamiento; Optuna encontró después una red mayor con GELU que mejoró nuevamente en los cinco folds de confirmación.</w:t>
+        <w:t>La mejora total contra el baseline fue de 10,025.92 USD (27.2%). La red profunda sin regularización alcanzó RMSE train de 8,021 pero CV de 33,963, evidencia de sobreajuste. El baseline log1p obtuvo 44,354: simetrizar el target no alineó la loss con la penalización absoluta del RMSE oficial. RobustScaler, clipping, weight decay y dropout estabilizaron el entrenamiento; Optuna encontró después una red mayor con GELU que mejoró nuevamente en los cinco folds de confirmación.</w:t>
       </w:r>
     </w:p>
     <w:p>
@@ -4472,7 +4472,7 @@
           <w:color w:val="555555"/>
           <w:sz w:val="18"/>
         </w:rPr>
-        <w:t>Figura 5. Curvas representativas del MLP baseline.</w:t>
+        <w:t>Figura 5. Loss y RMSE de entrenamiento/validación del MLP baseline.</w:t>
       </w:r>
     </w:p>
     <w:p>
@@ -4529,7 +4529,7 @@
           <w:color w:val="555555"/>
           <w:sz w:val="18"/>
         </w:rPr>
-        <w:t>Figura 6. Curvas representativas del modelo ganador en CV.</w:t>
+        <w:t>Figura 6. Loss y RMSE de entrenamiento/validación del modelo ganador en CV.</w:t>
       </w:r>
     </w:p>
     <w:p>
@@ -4555,7 +4555,7 @@
     </w:p>
     <w:p>
       <w:r>
-        <w:t>La CV confirmatoria fue 26,847.57 +/- 3,545.49 USD y el holdout independiente 17,754.33 USD. El holdout favorable no reemplaza la CV: contiene solo 234 casos y su composición produce una estimación más optimista. La selección se basa por tanto en la media de cinco folds. El gap train-CV del ganador (12,786 vs. 26,848) muestra capacidad suficiente y sobreajuste residual, pero menor inestabilidad que la red profunda sin regularización.</w:t>
+        <w:t>La CV confirmatoria fue 26,847.57 +/- 3,545.49 USD y el holdout independiente 19,916.20 USD. El holdout favorable no reemplaza la CV: contiene solo 234 casos y su composición produce una estimación más optimista. La selección se basa por tanto en la media de cinco folds. El gap train-CV del ganador (12,786 vs. 26,848) muestra capacidad suficiente y sobreajuste residual, pero menor inestabilidad que la red profunda sin regularización.</w:t>
       </w:r>
     </w:p>
     <w:p>
@@ -4797,7 +4797,7 @@
                 <w:rFonts w:ascii="Calibri" w:hAnsi="Calibri"/>
                 <w:sz w:val="18"/>
               </w:rPr>
-              <w:t>13,012</w:t>
+              <w:t>15,660</w:t>
             </w:r>
           </w:p>
         </w:tc>
@@ -4822,7 +4822,7 @@
                 <w:rFonts w:ascii="Calibri" w:hAnsi="Calibri"/>
                 <w:sz w:val="18"/>
               </w:rPr>
-              <w:t>9,159</w:t>
+              <w:t>11,383</w:t>
             </w:r>
           </w:p>
         </w:tc>
@@ -4847,7 +4847,7 @@
                 <w:rFonts w:ascii="Calibri" w:hAnsi="Calibri"/>
                 <w:sz w:val="18"/>
               </w:rPr>
-              <w:t>-5,850</w:t>
+              <w:t>-9,313</w:t>
             </w:r>
           </w:p>
         </w:tc>
@@ -4927,7 +4927,7 @@
                 <w:rFonts w:ascii="Calibri" w:hAnsi="Calibri"/>
                 <w:sz w:val="18"/>
               </w:rPr>
-              <w:t>13,031</w:t>
+              <w:t>12,610</w:t>
             </w:r>
           </w:p>
         </w:tc>
@@ -4952,7 +4952,7 @@
                 <w:rFonts w:ascii="Calibri" w:hAnsi="Calibri"/>
                 <w:sz w:val="18"/>
               </w:rPr>
-              <w:t>9,197</w:t>
+              <w:t>8,955</w:t>
             </w:r>
           </w:p>
         </w:tc>
@@ -4977,7 +4977,7 @@
                 <w:rFonts w:ascii="Calibri" w:hAnsi="Calibri"/>
                 <w:sz w:val="18"/>
               </w:rPr>
-              <w:t>-771</w:t>
+              <w:t>-1,810</w:t>
             </w:r>
           </w:p>
         </w:tc>
@@ -5057,7 +5057,7 @@
                 <w:rFonts w:ascii="Calibri" w:hAnsi="Calibri"/>
                 <w:sz w:val="18"/>
               </w:rPr>
-              <w:t>12,528</w:t>
+              <w:t>13,067</w:t>
             </w:r>
           </w:p>
         </w:tc>
@@ -5082,7 +5082,7 @@
                 <w:rFonts w:ascii="Calibri" w:hAnsi="Calibri"/>
                 <w:sz w:val="18"/>
               </w:rPr>
-              <w:t>10,197</w:t>
+              <w:t>10,311</w:t>
             </w:r>
           </w:p>
         </w:tc>
@@ -5107,7 +5107,7 @@
                 <w:rFonts w:ascii="Calibri" w:hAnsi="Calibri"/>
                 <w:sz w:val="18"/>
               </w:rPr>
-              <w:t>-764</w:t>
+              <w:t>1,593</w:t>
             </w:r>
           </w:p>
         </w:tc>
@@ -5187,7 +5187,7 @@
                 <w:rFonts w:ascii="Calibri" w:hAnsi="Calibri"/>
                 <w:sz w:val="18"/>
               </w:rPr>
-              <w:t>27,562</w:t>
+              <w:t>31,682</w:t>
             </w:r>
           </w:p>
         </w:tc>
@@ -5212,7 +5212,7 @@
                 <w:rFonts w:ascii="Calibri" w:hAnsi="Calibri"/>
                 <w:sz w:val="18"/>
               </w:rPr>
-              <w:t>20,892</w:t>
+              <w:t>24,137</w:t>
             </w:r>
           </w:p>
         </w:tc>
@@ -5237,7 +5237,7 @@
                 <w:rFonts w:ascii="Calibri" w:hAnsi="Calibri"/>
                 <w:sz w:val="18"/>
               </w:rPr>
-              <w:t>6,182</w:t>
+              <w:t>14,781</w:t>
             </w:r>
           </w:p>
         </w:tc>
@@ -5250,7 +5250,7 @@
     </w:p>
     <w:p>
       <w:r>
-        <w:t>Los tres cuartiles inferiores tienen RMSE entre 12,528 y 13,031 USD, mientras el cuartil alto sube a 27,562. El sesgo de +6,182 en casas caras indica subestimación; en el segmento bajo el sesgo negativo indica sobreestimación. Este patron es coherente con regresión hacia la media y con menos ejemplos en la cola del precio.</w:t>
+        <w:t>Los tres cuartiles inferiores tienen RMSE entre 12,610 y 15,660 USD, mientras el cuartil alto sube a 31,682. El sesgo de +14,781 en casas caras indica subestimación; en el segmento bajo el sesgo negativo indica sobreestimación. Este patrón es coherente con regresión hacia la media y con menos ejemplos en la cola del precio.</w:t>
       </w:r>
     </w:p>
     <w:tbl>
@@ -5434,6 +5434,266 @@
                 <w:rFonts w:ascii="Calibri" w:hAnsi="Calibri"/>
                 <w:sz w:val="18"/>
               </w:rPr>
+              <w:t>474</w:t>
+            </w:r>
+          </w:p>
+        </w:tc>
+        <w:tc>
+          <w:tcPr>
+            <w:tcW w:type="dxa" w:w="1800"/>
+            <w:tcMar>
+              <w:top w:w="80" w:type="dxa"/>
+              <w:start w:w="120" w:type="dxa"/>
+              <w:bottom w:w="80" w:type="dxa"/>
+              <w:end w:w="120" w:type="dxa"/>
+            </w:tcMar>
+            <w:vAlign w:val="center"/>
+          </w:tcPr>
+          <w:p>
+            <w:pPr>
+              <w:spacing w:after="0"/>
+              <w:jc w:val="left"/>
+            </w:pPr>
+            <w:r>
+              <w:rPr>
+                <w:rFonts w:ascii="Calibri" w:hAnsi="Calibri"/>
+                <w:sz w:val="18"/>
+              </w:rPr>
+              <w:t>440,000</w:t>
+            </w:r>
+          </w:p>
+        </w:tc>
+        <w:tc>
+          <w:tcPr>
+            <w:tcW w:type="dxa" w:w="1800"/>
+            <w:tcMar>
+              <w:top w:w="80" w:type="dxa"/>
+              <w:start w:w="120" w:type="dxa"/>
+              <w:bottom w:w="80" w:type="dxa"/>
+              <w:end w:w="120" w:type="dxa"/>
+            </w:tcMar>
+            <w:vAlign w:val="center"/>
+          </w:tcPr>
+          <w:p>
+            <w:pPr>
+              <w:spacing w:after="0"/>
+              <w:jc w:val="left"/>
+            </w:pPr>
+            <w:r>
+              <w:rPr>
+                <w:rFonts w:ascii="Calibri" w:hAnsi="Calibri"/>
+                <w:sz w:val="18"/>
+              </w:rPr>
+              <w:t>343,786</w:t>
+            </w:r>
+          </w:p>
+        </w:tc>
+        <w:tc>
+          <w:tcPr>
+            <w:tcW w:type="dxa" w:w="1900"/>
+            <w:tcMar>
+              <w:top w:w="80" w:type="dxa"/>
+              <w:start w:w="120" w:type="dxa"/>
+              <w:bottom w:w="80" w:type="dxa"/>
+              <w:end w:w="120" w:type="dxa"/>
+            </w:tcMar>
+            <w:vAlign w:val="center"/>
+          </w:tcPr>
+          <w:p>
+            <w:pPr>
+              <w:spacing w:after="0"/>
+              <w:jc w:val="right"/>
+            </w:pPr>
+            <w:r>
+              <w:rPr>
+                <w:rFonts w:ascii="Calibri" w:hAnsi="Calibri"/>
+                <w:sz w:val="18"/>
+              </w:rPr>
+              <w:t>96,214</w:t>
+            </w:r>
+          </w:p>
+        </w:tc>
+        <w:tc>
+          <w:tcPr>
+            <w:tcW w:type="dxa" w:w="2960"/>
+            <w:tcMar>
+              <w:top w:w="80" w:type="dxa"/>
+              <w:start w:w="120" w:type="dxa"/>
+              <w:bottom w:w="80" w:type="dxa"/>
+              <w:end w:w="120" w:type="dxa"/>
+            </w:tcMar>
+            <w:vAlign w:val="center"/>
+          </w:tcPr>
+          <w:p>
+            <w:pPr>
+              <w:spacing w:after="0"/>
+              <w:jc w:val="right"/>
+            </w:pPr>
+            <w:r>
+              <w:rPr>
+                <w:rFonts w:ascii="Calibri" w:hAnsi="Calibri"/>
+                <w:sz w:val="18"/>
+              </w:rPr>
+              <w:t>NridgHt</w:t>
+            </w:r>
+          </w:p>
+        </w:tc>
+      </w:tr>
+      <w:tr>
+        <w:trPr>
+          <w:cantSplit/>
+        </w:trPr>
+        <w:tc>
+          <w:tcPr>
+            <w:tcW w:type="dxa" w:w="900"/>
+            <w:tcMar>
+              <w:top w:w="80" w:type="dxa"/>
+              <w:start w:w="120" w:type="dxa"/>
+              <w:bottom w:w="80" w:type="dxa"/>
+              <w:end w:w="120" w:type="dxa"/>
+            </w:tcMar>
+            <w:vAlign w:val="center"/>
+          </w:tcPr>
+          <w:p>
+            <w:pPr>
+              <w:spacing w:after="0"/>
+              <w:jc w:val="left"/>
+            </w:pPr>
+            <w:r>
+              <w:rPr>
+                <w:rFonts w:ascii="Calibri" w:hAnsi="Calibri"/>
+                <w:sz w:val="18"/>
+              </w:rPr>
+              <w:t>54</w:t>
+            </w:r>
+          </w:p>
+        </w:tc>
+        <w:tc>
+          <w:tcPr>
+            <w:tcW w:type="dxa" w:w="1800"/>
+            <w:tcMar>
+              <w:top w:w="80" w:type="dxa"/>
+              <w:start w:w="120" w:type="dxa"/>
+              <w:bottom w:w="80" w:type="dxa"/>
+              <w:end w:w="120" w:type="dxa"/>
+            </w:tcMar>
+            <w:vAlign w:val="center"/>
+          </w:tcPr>
+          <w:p>
+            <w:pPr>
+              <w:spacing w:after="0"/>
+              <w:jc w:val="left"/>
+            </w:pPr>
+            <w:r>
+              <w:rPr>
+                <w:rFonts w:ascii="Calibri" w:hAnsi="Calibri"/>
+                <w:sz w:val="18"/>
+              </w:rPr>
+              <w:t>385,000</w:t>
+            </w:r>
+          </w:p>
+        </w:tc>
+        <w:tc>
+          <w:tcPr>
+            <w:tcW w:type="dxa" w:w="1800"/>
+            <w:tcMar>
+              <w:top w:w="80" w:type="dxa"/>
+              <w:start w:w="120" w:type="dxa"/>
+              <w:bottom w:w="80" w:type="dxa"/>
+              <w:end w:w="120" w:type="dxa"/>
+            </w:tcMar>
+            <w:vAlign w:val="center"/>
+          </w:tcPr>
+          <w:p>
+            <w:pPr>
+              <w:spacing w:after="0"/>
+              <w:jc w:val="left"/>
+            </w:pPr>
+            <w:r>
+              <w:rPr>
+                <w:rFonts w:ascii="Calibri" w:hAnsi="Calibri"/>
+                <w:sz w:val="18"/>
+              </w:rPr>
+              <w:t>299,615</w:t>
+            </w:r>
+          </w:p>
+        </w:tc>
+        <w:tc>
+          <w:tcPr>
+            <w:tcW w:type="dxa" w:w="1900"/>
+            <w:tcMar>
+              <w:top w:w="80" w:type="dxa"/>
+              <w:start w:w="120" w:type="dxa"/>
+              <w:bottom w:w="80" w:type="dxa"/>
+              <w:end w:w="120" w:type="dxa"/>
+            </w:tcMar>
+            <w:vAlign w:val="center"/>
+          </w:tcPr>
+          <w:p>
+            <w:pPr>
+              <w:spacing w:after="0"/>
+              <w:jc w:val="right"/>
+            </w:pPr>
+            <w:r>
+              <w:rPr>
+                <w:rFonts w:ascii="Calibri" w:hAnsi="Calibri"/>
+                <w:sz w:val="18"/>
+              </w:rPr>
+              <w:t>85,385</w:t>
+            </w:r>
+          </w:p>
+        </w:tc>
+        <w:tc>
+          <w:tcPr>
+            <w:tcW w:type="dxa" w:w="2960"/>
+            <w:tcMar>
+              <w:top w:w="80" w:type="dxa"/>
+              <w:start w:w="120" w:type="dxa"/>
+              <w:bottom w:w="80" w:type="dxa"/>
+              <w:end w:w="120" w:type="dxa"/>
+            </w:tcMar>
+            <w:vAlign w:val="center"/>
+          </w:tcPr>
+          <w:p>
+            <w:pPr>
+              <w:spacing w:after="0"/>
+              <w:jc w:val="right"/>
+            </w:pPr>
+            <w:r>
+              <w:rPr>
+                <w:rFonts w:ascii="Calibri" w:hAnsi="Calibri"/>
+                <w:sz w:val="18"/>
+              </w:rPr>
+              <w:t>Veenker</w:t>
+            </w:r>
+          </w:p>
+        </w:tc>
+      </w:tr>
+      <w:tr>
+        <w:trPr>
+          <w:cantSplit/>
+        </w:trPr>
+        <w:tc>
+          <w:tcPr>
+            <w:tcW w:type="dxa" w:w="900"/>
+            <w:tcMar>
+              <w:top w:w="80" w:type="dxa"/>
+              <w:start w:w="120" w:type="dxa"/>
+              <w:bottom w:w="80" w:type="dxa"/>
+              <w:end w:w="120" w:type="dxa"/>
+            </w:tcMar>
+            <w:vAlign w:val="center"/>
+          </w:tcPr>
+          <w:p>
+            <w:pPr>
+              <w:spacing w:after="0"/>
+              <w:jc w:val="left"/>
+            </w:pPr>
+            <w:r>
+              <w:rPr>
+                <w:rFonts w:ascii="Calibri" w:hAnsi="Calibri"/>
+                <w:sz w:val="18"/>
+              </w:rPr>
               <w:t>1182</w:t>
             </w:r>
           </w:p>
@@ -5484,7 +5744,7 @@
                 <w:rFonts w:ascii="Calibri" w:hAnsi="Calibri"/>
                 <w:sz w:val="18"/>
               </w:rPr>
-              <w:t>341,064</w:t>
+              <w:t>326,993</w:t>
             </w:r>
           </w:p>
         </w:tc>
@@ -5509,7 +5769,7 @@
                 <w:rFonts w:ascii="Calibri" w:hAnsi="Calibri"/>
                 <w:sz w:val="18"/>
               </w:rPr>
-              <w:t>51,436</w:t>
+              <w:t>65,507</w:t>
             </w:r>
           </w:p>
         </w:tc>
@@ -5564,7 +5824,7 @@
                 <w:rFonts w:ascii="Calibri" w:hAnsi="Calibri"/>
                 <w:sz w:val="18"/>
               </w:rPr>
-              <w:t>1108</w:t>
+              <w:t>379</w:t>
             </w:r>
           </w:p>
         </w:tc>
@@ -5589,7 +5849,7 @@
                 <w:rFonts w:ascii="Calibri" w:hAnsi="Calibri"/>
                 <w:sz w:val="18"/>
               </w:rPr>
-              <w:t>274,725</w:t>
+              <w:t>394,432</w:t>
             </w:r>
           </w:p>
         </w:tc>
@@ -5614,7 +5874,7 @@
                 <w:rFonts w:ascii="Calibri" w:hAnsi="Calibri"/>
                 <w:sz w:val="18"/>
               </w:rPr>
-              <w:t>223,988</w:t>
+              <w:t>330,819</w:t>
             </w:r>
           </w:p>
         </w:tc>
@@ -5639,7 +5899,7 @@
                 <w:rFonts w:ascii="Calibri" w:hAnsi="Calibri"/>
                 <w:sz w:val="18"/>
               </w:rPr>
-              <w:t>50,737</w:t>
+              <w:t>63,613</w:t>
             </w:r>
           </w:p>
         </w:tc>
@@ -5664,7 +5924,7 @@
                 <w:rFonts w:ascii="Calibri" w:hAnsi="Calibri"/>
                 <w:sz w:val="18"/>
               </w:rPr>
-              <w:t>Gilbert</w:t>
+              <w:t>StoneBr</w:t>
             </w:r>
           </w:p>
         </w:tc>
@@ -5694,7 +5954,7 @@
                 <w:rFonts w:ascii="Calibri" w:hAnsi="Calibri"/>
                 <w:sz w:val="18"/>
               </w:rPr>
-              <w:t>525</w:t>
+              <w:t>1038</w:t>
             </w:r>
           </w:p>
         </w:tc>
@@ -5719,7 +5979,7 @@
                 <w:rFonts w:ascii="Calibri" w:hAnsi="Calibri"/>
                 <w:sz w:val="18"/>
               </w:rPr>
-              <w:t>315,750</w:t>
+              <w:t>287,000</w:t>
             </w:r>
           </w:p>
         </w:tc>
@@ -5744,7 +6004,7 @@
                 <w:rFonts w:ascii="Calibri" w:hAnsi="Calibri"/>
                 <w:sz w:val="18"/>
               </w:rPr>
-              <w:t>297,554</w:t>
+              <w:t>231,633</w:t>
             </w:r>
           </w:p>
         </w:tc>
@@ -5769,7 +6029,7 @@
                 <w:rFonts w:ascii="Calibri" w:hAnsi="Calibri"/>
                 <w:sz w:val="18"/>
               </w:rPr>
-              <w:t>18,196</w:t>
+              <w:t>55,367</w:t>
             </w:r>
           </w:p>
         </w:tc>
@@ -5794,267 +6054,7 @@
                 <w:rFonts w:ascii="Calibri" w:hAnsi="Calibri"/>
                 <w:sz w:val="18"/>
               </w:rPr>
-              <w:t>NoRidge</w:t>
-            </w:r>
-          </w:p>
-        </w:tc>
-      </w:tr>
-      <w:tr>
-        <w:trPr>
-          <w:cantSplit/>
-        </w:trPr>
-        <w:tc>
-          <w:tcPr>
-            <w:tcW w:type="dxa" w:w="900"/>
-            <w:tcMar>
-              <w:top w:w="80" w:type="dxa"/>
-              <w:start w:w="120" w:type="dxa"/>
-              <w:bottom w:w="80" w:type="dxa"/>
-              <w:end w:w="120" w:type="dxa"/>
-            </w:tcMar>
-            <w:vAlign w:val="center"/>
-          </w:tcPr>
-          <w:p>
-            <w:pPr>
-              <w:spacing w:after="0"/>
-              <w:jc w:val="left"/>
-            </w:pPr>
-            <w:r>
-              <w:rPr>
-                <w:rFonts w:ascii="Calibri" w:hAnsi="Calibri"/>
-                <w:sz w:val="18"/>
-              </w:rPr>
-              <w:t>2</w:t>
-            </w:r>
-          </w:p>
-        </w:tc>
-        <w:tc>
-          <w:tcPr>
-            <w:tcW w:type="dxa" w:w="1800"/>
-            <w:tcMar>
-              <w:top w:w="80" w:type="dxa"/>
-              <w:start w:w="120" w:type="dxa"/>
-              <w:bottom w:w="80" w:type="dxa"/>
-              <w:end w:w="120" w:type="dxa"/>
-            </w:tcMar>
-            <w:vAlign w:val="center"/>
-          </w:tcPr>
-          <w:p>
-            <w:pPr>
-              <w:spacing w:after="0"/>
-              <w:jc w:val="left"/>
-            </w:pPr>
-            <w:r>
-              <w:rPr>
-                <w:rFonts w:ascii="Calibri" w:hAnsi="Calibri"/>
-                <w:sz w:val="18"/>
-              </w:rPr>
-              <w:t>181,500</w:t>
-            </w:r>
-          </w:p>
-        </w:tc>
-        <w:tc>
-          <w:tcPr>
-            <w:tcW w:type="dxa" w:w="1800"/>
-            <w:tcMar>
-              <w:top w:w="80" w:type="dxa"/>
-              <w:start w:w="120" w:type="dxa"/>
-              <w:bottom w:w="80" w:type="dxa"/>
-              <w:end w:w="120" w:type="dxa"/>
-            </w:tcMar>
-            <w:vAlign w:val="center"/>
-          </w:tcPr>
-          <w:p>
-            <w:pPr>
-              <w:spacing w:after="0"/>
-              <w:jc w:val="left"/>
-            </w:pPr>
-            <w:r>
-              <w:rPr>
-                <w:rFonts w:ascii="Calibri" w:hAnsi="Calibri"/>
-                <w:sz w:val="18"/>
-              </w:rPr>
-              <w:t>198,956</w:t>
-            </w:r>
-          </w:p>
-        </w:tc>
-        <w:tc>
-          <w:tcPr>
-            <w:tcW w:type="dxa" w:w="1900"/>
-            <w:tcMar>
-              <w:top w:w="80" w:type="dxa"/>
-              <w:start w:w="120" w:type="dxa"/>
-              <w:bottom w:w="80" w:type="dxa"/>
-              <w:end w:w="120" w:type="dxa"/>
-            </w:tcMar>
-            <w:vAlign w:val="center"/>
-          </w:tcPr>
-          <w:p>
-            <w:pPr>
-              <w:spacing w:after="0"/>
-              <w:jc w:val="right"/>
-            </w:pPr>
-            <w:r>
-              <w:rPr>
-                <w:rFonts w:ascii="Calibri" w:hAnsi="Calibri"/>
-                <w:sz w:val="18"/>
-              </w:rPr>
-              <w:t>17,456</w:t>
-            </w:r>
-          </w:p>
-        </w:tc>
-        <w:tc>
-          <w:tcPr>
-            <w:tcW w:type="dxa" w:w="2960"/>
-            <w:tcMar>
-              <w:top w:w="80" w:type="dxa"/>
-              <w:start w:w="120" w:type="dxa"/>
-              <w:bottom w:w="80" w:type="dxa"/>
-              <w:end w:w="120" w:type="dxa"/>
-            </w:tcMar>
-            <w:vAlign w:val="center"/>
-          </w:tcPr>
-          <w:p>
-            <w:pPr>
-              <w:spacing w:after="0"/>
-              <w:jc w:val="right"/>
-            </w:pPr>
-            <w:r>
-              <w:rPr>
-                <w:rFonts w:ascii="Calibri" w:hAnsi="Calibri"/>
-                <w:sz w:val="18"/>
-              </w:rPr>
-              <w:t>Veenker</w:t>
-            </w:r>
-          </w:p>
-        </w:tc>
-      </w:tr>
-      <w:tr>
-        <w:trPr>
-          <w:cantSplit/>
-        </w:trPr>
-        <w:tc>
-          <w:tcPr>
-            <w:tcW w:type="dxa" w:w="900"/>
-            <w:tcMar>
-              <w:top w:w="80" w:type="dxa"/>
-              <w:start w:w="120" w:type="dxa"/>
-              <w:bottom w:w="80" w:type="dxa"/>
-              <w:end w:w="120" w:type="dxa"/>
-            </w:tcMar>
-            <w:vAlign w:val="center"/>
-          </w:tcPr>
-          <w:p>
-            <w:pPr>
-              <w:spacing w:after="0"/>
-              <w:jc w:val="left"/>
-            </w:pPr>
-            <w:r>
-              <w:rPr>
-                <w:rFonts w:ascii="Calibri" w:hAnsi="Calibri"/>
-                <w:sz w:val="18"/>
-              </w:rPr>
-              <w:t>330</w:t>
-            </w:r>
-          </w:p>
-        </w:tc>
-        <w:tc>
-          <w:tcPr>
-            <w:tcW w:type="dxa" w:w="1800"/>
-            <w:tcMar>
-              <w:top w:w="80" w:type="dxa"/>
-              <w:start w:w="120" w:type="dxa"/>
-              <w:bottom w:w="80" w:type="dxa"/>
-              <w:end w:w="120" w:type="dxa"/>
-            </w:tcMar>
-            <w:vAlign w:val="center"/>
-          </w:tcPr>
-          <w:p>
-            <w:pPr>
-              <w:spacing w:after="0"/>
-              <w:jc w:val="left"/>
-            </w:pPr>
-            <w:r>
-              <w:rPr>
-                <w:rFonts w:ascii="Calibri" w:hAnsi="Calibri"/>
-                <w:sz w:val="18"/>
-              </w:rPr>
-              <w:t>78,000</w:t>
-            </w:r>
-          </w:p>
-        </w:tc>
-        <w:tc>
-          <w:tcPr>
-            <w:tcW w:type="dxa" w:w="1800"/>
-            <w:tcMar>
-              <w:top w:w="80" w:type="dxa"/>
-              <w:start w:w="120" w:type="dxa"/>
-              <w:bottom w:w="80" w:type="dxa"/>
-              <w:end w:w="120" w:type="dxa"/>
-            </w:tcMar>
-            <w:vAlign w:val="center"/>
-          </w:tcPr>
-          <w:p>
-            <w:pPr>
-              <w:spacing w:after="0"/>
-              <w:jc w:val="left"/>
-            </w:pPr>
-            <w:r>
-              <w:rPr>
-                <w:rFonts w:ascii="Calibri" w:hAnsi="Calibri"/>
-                <w:sz w:val="18"/>
-              </w:rPr>
-              <w:t>95,314</w:t>
-            </w:r>
-          </w:p>
-        </w:tc>
-        <w:tc>
-          <w:tcPr>
-            <w:tcW w:type="dxa" w:w="1900"/>
-            <w:tcMar>
-              <w:top w:w="80" w:type="dxa"/>
-              <w:start w:w="120" w:type="dxa"/>
-              <w:bottom w:w="80" w:type="dxa"/>
-              <w:end w:w="120" w:type="dxa"/>
-            </w:tcMar>
-            <w:vAlign w:val="center"/>
-          </w:tcPr>
-          <w:p>
-            <w:pPr>
-              <w:spacing w:after="0"/>
-              <w:jc w:val="right"/>
-            </w:pPr>
-            <w:r>
-              <w:rPr>
-                <w:rFonts w:ascii="Calibri" w:hAnsi="Calibri"/>
-                <w:sz w:val="18"/>
-              </w:rPr>
-              <w:t>17,314</w:t>
-            </w:r>
-          </w:p>
-        </w:tc>
-        <w:tc>
-          <w:tcPr>
-            <w:tcW w:type="dxa" w:w="2960"/>
-            <w:tcMar>
-              <w:top w:w="80" w:type="dxa"/>
-              <w:start w:w="120" w:type="dxa"/>
-              <w:bottom w:w="80" w:type="dxa"/>
-              <w:end w:w="120" w:type="dxa"/>
-            </w:tcMar>
-            <w:vAlign w:val="center"/>
-          </w:tcPr>
-          <w:p>
-            <w:pPr>
-              <w:spacing w:after="0"/>
-              <w:jc w:val="right"/>
-            </w:pPr>
-            <w:r>
-              <w:rPr>
-                <w:rFonts w:ascii="Calibri" w:hAnsi="Calibri"/>
-                <w:sz w:val="18"/>
-              </w:rPr>
-              <w:t>IDOTRR</w:t>
+              <w:t>CollgCr</w:t>
             </w:r>
           </w:p>
         </w:tc>
@@ -6074,7 +6074,7 @@
       <w:r>
         <w:drawing>
           <wp:inline xmlns:a="http://schemas.openxmlformats.org/drawingml/2006/main" xmlns:pic="http://schemas.openxmlformats.org/drawingml/2006/picture">
-            <wp:extent cx="5532120" cy="4598898"/>
+            <wp:extent cx="5532120" cy="4603200"/>
             <wp:docPr id="7" name="Picture 7"/>
             <wp:cNvGraphicFramePr>
               <a:graphicFrameLocks noChangeAspect="1"/>
@@ -6095,7 +6095,7 @@
                   <pic:spPr>
                     <a:xfrm>
                       <a:off x="0" y="0"/>
-                      <a:ext cx="5532120" cy="4598898"/>
+                      <a:ext cx="5532120" cy="4603200"/>
                     </a:xfrm>
                     <a:prstGeom prst="rect"/>
                   </pic:spPr>
@@ -6124,7 +6124,7 @@
     </w:p>
     <w:p>
       <w:r>
-        <w:t>El error medio absoluto fue 12,384.06 USD y el sesgo global -296.81 USD, cercano a cero. Los mayores errores se concentran en propiedades caras o poco comunes; no se observa un desplazamiento global fuerte, pero si heterocedasticidad: la amplitud de los residuos aumenta con la predicción.</w:t>
+        <w:t>El error medio absoluto fue 13,731.26 USD y el sesgo global 1,325.04 USD, cercano a cero. Los mayores errores se concentran en propiedades caras o poco comunes; no se observa un desplazamiento global fuerte, pero sí heterocedasticidad: la amplitud de los residuos aumenta con la predicción.</w:t>
       </w:r>
     </w:p>
     <w:p>
@@ -6177,7 +6177,7 @@
         <w:ind w:left="720" w:hanging="360"/>
       </w:pPr>
       <w:r>
-        <w:t>La búsqueda de 17 trials es seria pero no exhaustiva; más seeds y repeated CV reducirían incertidumbre a mayor costo computacional.</w:t>
+        <w:t>La búsqueda de 18 trials es seria pero no exhaustiva; más seeds y repeated CV reducirían incertidumbre a mayor costo computacional.</w:t>
       </w:r>
     </w:p>
     <w:p>
@@ -6190,12 +6190,12 @@
     </w:p>
     <w:p>
       <w:r>
-        <w:t>El MLP final usa capas 512-256-128-64, GELU, dropout 0.167, Adam, learning rate 0.0003244, weight decay 0.0008082 y batch 64. Con preprocessing robusto e ingeniería de variables alcanzó 26,847.57 USD de RMSE CV, una reducción de 27.2% contra el baseline. El holdout de 17,754.33 USD confirma que el pipeline generaliza, aunque el desempeño es peor y más variable en viviendas del cuartil superior.</w:t>
+        <w:t>El MLP final usa capas 512-256-128-64, GELU, dropout 0.167, Adam, learning rate 0.0003244, weight decay 0.0008082 y batch 64. Con preprocessing reproducible e ingeniería de variables alcanzó 26,847.57 USD de RMSE CV, una reducción de 27.2% contra el baseline. El holdout de 19,916.20 USD confirma que el pipeline generaliza, aunque el desempeño es peor y más variable en viviendas del cuartil superior.</w:t>
       </w:r>
     </w:p>
     <w:p>
       <w:r>
-        <w:t>Los aprendizajes principales fueron: ajustar todo preprocessing dentro del fold, optimizar la métrica en escala original, regularizar redes profundas y confirmar los mejores trials con una partición distinta. Como mejoras futuras convendria repetir CV con más seeds, explorar embeddings categóricos, ensembles de MLPs con seeds distintas y una loss ponderada/calibracion que reduzca la subestimación de propiedades caras, siempre válidando el RMSE original.</w:t>
+        <w:t>Los aprendizajes principales fueron: ajustar todo preprocessing dentro del fold, optimizar la métrica en escala original, regularizar redes profundas y confirmar los mejores trials con una partición distinta. Como mejoras futuras convendría repetir CV con más seeds, explorar embeddings categóricos, ensembles de MLPs con seeds distintas y una loss ponderada/calibración que reduzca la subestimación de propiedades caras, siempre validando el RMSE original.</w:t>
       </w:r>
     </w:p>
     <w:p>
@@ -6666,7 +6666,7 @@
         <w:color w:val="666666"/>
         <w:sz w:val="18"/>
       </w:rPr>
-      <w:t xml:space="preserve">Pagina </w:t>
+      <w:t xml:space="preserve">Página </w:t>
       <w:fldChar w:fldCharType="begin"/>
       <w:instrText xml:space="preserve"> PAGE </w:instrText>
       <w:fldChar w:fldCharType="separate"/>

</xml_diff>